<commit_message>
Refresh the AI resume's Claude Code figures to 31 Oct
901 hours, 19,002 prompts, 50 projects, 195 active days, from the same
claude-usage.json the site renders. It still said 772 hours from September.

Co-Authored-By: Claude Opus 5.5 <noreply@anthropic.com>
</commit_message>
<xml_diff>
--- a/Kim_Julongbayan_Resume_AI.docx
+++ b/Kim_Julongbayan_Resume_AI.docx
@@ -83,7 +83,10 @@
         <w:ind w:left="230" w:hanging="230"/>
       </w:pPr>
       <w:r>
-        <w:t>772 hours and 16,252 prompts in Claude Code across 43 projects (149 active days, as of Sep 2026), counted from session transcripts and published at kimlj.dev.</w:t>
+        <w:t>901 hours and 19,002 prompts in Claude Code across 50 projects (195 active days, as of Oct 2026)</w:t>
+      </w:r>
+      <w:r>
+        <w:t>, counted from session transcripts and published at kimlj.dev.</w:t>
       </w:r>
     </w:p>
     <w:p>

</xml_diff>